<commit_message>
Deployed f6fe2ec with MkDocs version: 1.4.2
</commit_message>
<xml_diff>
--- a/Additional information on admission.docx
+++ b/Additional information on admission.docx
@@ -1,6 +1,6 @@
 
 <file path=word/document.xml><?xml version="1.0" encoding="utf-8"?>
-<w:document xmlns:wpc="http://schemas.microsoft.com/office/word/2010/wordprocessingCanvas" xmlns:mo="http://schemas.microsoft.com/office/mac/office/2008/main" xmlns:mc="http://schemas.openxmlformats.org/markup-compatibility/2006" xmlns:mv="urn:schemas-microsoft-com:mac:vml" xmlns:o="urn:schemas-microsoft-com:office:office" xmlns:r="http://schemas.openxmlformats.org/officeDocument/2006/relationships" xmlns:m="http://schemas.openxmlformats.org/officeDocument/2006/math" xmlns:v="urn:schemas-microsoft-com:vml" xmlns:wp14="http://schemas.microsoft.com/office/word/2010/wordprocessingDrawing" xmlns:wp="http://schemas.openxmlformats.org/drawingml/2006/wordprocessingDrawing" xmlns:w10="urn:schemas-microsoft-com:office:word" xmlns:w="http://schemas.openxmlformats.org/wordprocessingml/2006/main" xmlns:w14="http://schemas.microsoft.com/office/word/2010/wordml" xmlns:w15="http://schemas.microsoft.com/office/word/2012/wordml" xmlns:wpg="http://schemas.microsoft.com/office/word/2010/wordprocessingGroup" xmlns:wpi="http://schemas.microsoft.com/office/word/2010/wordprocessingInk" xmlns:wne="http://schemas.microsoft.com/office/word/2006/wordml" xmlns:wps="http://schemas.microsoft.com/office/word/2010/wordprocessingShape" mc:Ignorable="w14 w15 wp14">
+<w:document xmlns:wpc="http://schemas.microsoft.com/office/word/2010/wordprocessingCanvas" xmlns:cx="http://schemas.microsoft.com/office/drawing/2014/chartex" xmlns:cx1="http://schemas.microsoft.com/office/drawing/2015/9/8/chartex" xmlns:cx2="http://schemas.microsoft.com/office/drawing/2015/10/21/chartex" xmlns:cx3="http://schemas.microsoft.com/office/drawing/2016/5/9/chartex" xmlns:cx4="http://schemas.microsoft.com/office/drawing/2016/5/10/chartex" xmlns:cx5="http://schemas.microsoft.com/office/drawing/2016/5/11/chartex" xmlns:cx6="http://schemas.microsoft.com/office/drawing/2016/5/12/chartex" xmlns:cx7="http://schemas.microsoft.com/office/drawing/2016/5/13/chartex" xmlns:cx8="http://schemas.microsoft.com/office/drawing/2016/5/14/chartex" xmlns:mc="http://schemas.openxmlformats.org/markup-compatibility/2006" xmlns:m="http://schemas.openxmlformats.org/officeDocument/2006/math" xmlns:aink="http://schemas.microsoft.com/office/drawing/2016/ink" xmlns:am3d="http://schemas.microsoft.com/office/drawing/2017/model3d" xmlns:oel="http://schemas.microsoft.com/office/2019/extlst" xmlns:r="http://schemas.openxmlformats.org/officeDocument/2006/relationships" xmlns:wp14="http://schemas.microsoft.com/office/word/2010/wordprocessingDrawing" xmlns:wp="http://schemas.openxmlformats.org/drawingml/2006/wordprocessingDrawing" xmlns:wpg="http://schemas.microsoft.com/office/word/2010/wordprocessingGroup" xmlns:wpi="http://schemas.microsoft.com/office/word/2010/wordprocessingInk" xmlns:wps="http://schemas.microsoft.com/office/word/2010/wordprocessingShape" xmlns:o="urn:schemas-microsoft-com:office:office" xmlns:v="urn:schemas-microsoft-com:vml" xmlns:w10="urn:schemas-microsoft-com:office:word" xmlns:w="http://schemas.openxmlformats.org/wordprocessingml/2006/main" xmlns:w14="http://schemas.microsoft.com/office/word/2010/wordml" xmlns:w15="http://schemas.microsoft.com/office/word/2012/wordml" xmlns:w16cex="http://schemas.microsoft.com/office/word/2018/wordml/cex" xmlns:w16cid="http://schemas.microsoft.com/office/word/2016/wordml/cid" xmlns:w16="http://schemas.microsoft.com/office/word/2018/wordml" xmlns:w16sdtdh="http://schemas.microsoft.com/office/word/2020/wordml/sdtdatahash" xmlns:w16sdtfl="http://schemas.microsoft.com/office/word/2024/wordml/sdtformatlock" xmlns:w16se="http://schemas.microsoft.com/office/word/2015/wordml/symex" xmlns:w16du="http://schemas.microsoft.com/office/word/2023/wordml/word16du" xmlns:wne="http://schemas.microsoft.com/office/word/2006/wordml" mc:Ignorable="w14 w15 w16se w16cid w16 w16cex w16sdtdh w16sdtfl w16du wp14">
   <w:body>
     <w:p>
       <w:pPr>
@@ -24,8 +24,6 @@
     </w:p>
     <w:p/>
     <w:p>
-      <w:bookmarkStart w:id="0" w:name="_GoBack"/>
-      <w:bookmarkEnd w:id="0"/>
       <w:r>
         <w:rPr>
           <w:b/>
@@ -34,11 +32,15 @@
       </w:r>
       <w:r>
         <w:tab/>
+      </w:r>
+      <w:proofErr w:type="gramStart"/>
+      <w:r>
         <w:t xml:space="preserve">Ambulatory  </w:t>
       </w:r>
       <w:r>
         <w:tab/>
       </w:r>
+      <w:proofErr w:type="gramEnd"/>
       <w:r>
         <w:sym w:font="Symbol" w:char="F07F"/>
       </w:r>
@@ -389,7 +391,9 @@
       </w:r>
       <w:r>
         <w:softHyphen/>
-        <w:t>____________________________</w:t>
+      </w:r>
+      <w:r>
+        <w:sym w:font="Symbol" w:char="F07F"/>
       </w:r>
       <w:r>
         <w:tab/>
@@ -432,7 +436,7 @@
 </file>
 
 <file path=word/styles.xml><?xml version="1.0" encoding="utf-8"?>
-<w:styles xmlns:mc="http://schemas.openxmlformats.org/markup-compatibility/2006" xmlns:r="http://schemas.openxmlformats.org/officeDocument/2006/relationships" xmlns:w="http://schemas.openxmlformats.org/wordprocessingml/2006/main" xmlns:w14="http://schemas.microsoft.com/office/word/2010/wordml" xmlns:w15="http://schemas.microsoft.com/office/word/2012/wordml" mc:Ignorable="w14 w15">
+<w:styles xmlns:mc="http://schemas.openxmlformats.org/markup-compatibility/2006" xmlns:r="http://schemas.openxmlformats.org/officeDocument/2006/relationships" xmlns:w="http://schemas.openxmlformats.org/wordprocessingml/2006/main" xmlns:w14="http://schemas.microsoft.com/office/word/2010/wordml" xmlns:w15="http://schemas.microsoft.com/office/word/2012/wordml" xmlns:w16cex="http://schemas.microsoft.com/office/word/2018/wordml/cex" xmlns:w16cid="http://schemas.microsoft.com/office/word/2016/wordml/cid" xmlns:w16="http://schemas.microsoft.com/office/word/2018/wordml" xmlns:w16sdtdh="http://schemas.microsoft.com/office/word/2020/wordml/sdtdatahash" xmlns:w16sdtfl="http://schemas.microsoft.com/office/word/2024/wordml/sdtformatlock" xmlns:w16se="http://schemas.microsoft.com/office/word/2015/wordml/symex" xmlns:w16du="http://schemas.microsoft.com/office/word/2023/wordml/word16du" mc:Ignorable="w14 w15 w16se w16cid w16 w16cex w16sdtdh w16sdtfl w16du">
   <w:docDefaults>
     <w:rPrDefault>
       <w:rPr>
@@ -444,7 +448,7 @@
     </w:rPrDefault>
     <w:pPrDefault/>
   </w:docDefaults>
-  <w:latentStyles w:defLockedState="0" w:defUIPriority="99" w:defSemiHidden="0" w:defUnhideWhenUsed="0" w:defQFormat="0" w:count="382">
+  <w:latentStyles w:defLockedState="0" w:defUIPriority="99" w:defSemiHidden="0" w:defUnhideWhenUsed="0" w:defQFormat="0" w:count="376">
     <w:lsdException w:name="Normal" w:uiPriority="0" w:qFormat="1"/>
     <w:lsdException w:name="heading 1" w:uiPriority="9" w:qFormat="1"/>
     <w:lsdException w:name="heading 2" w:semiHidden="1" w:uiPriority="9" w:unhideWhenUsed="1" w:qFormat="1"/>
@@ -601,15 +605,6 @@
     <w:lsdException w:name="Balloon Text" w:semiHidden="1" w:unhideWhenUsed="1"/>
     <w:lsdException w:name="Table Grid" w:uiPriority="39"/>
     <w:lsdException w:name="Table Theme" w:semiHidden="1" w:unhideWhenUsed="1"/>
-    <w:lsdException w:name="Note Level 1" w:semiHidden="1" w:unhideWhenUsed="1"/>
-    <w:lsdException w:name="Note Level 2" w:semiHidden="1" w:unhideWhenUsed="1"/>
-    <w:lsdException w:name="Note Level 3" w:semiHidden="1" w:unhideWhenUsed="1"/>
-    <w:lsdException w:name="Note Level 4" w:semiHidden="1" w:unhideWhenUsed="1"/>
-    <w:lsdException w:name="Note Level 5" w:semiHidden="1" w:unhideWhenUsed="1"/>
-    <w:lsdException w:name="Note Level 6" w:semiHidden="1" w:unhideWhenUsed="1"/>
-    <w:lsdException w:name="Note Level 7" w:semiHidden="1" w:unhideWhenUsed="1"/>
-    <w:lsdException w:name="Note Level 8" w:semiHidden="1" w:unhideWhenUsed="1"/>
-    <w:lsdException w:name="Note Level 9" w:semiHidden="1" w:unhideWhenUsed="1"/>
     <w:lsdException w:name="Placeholder Text" w:semiHidden="1"/>
     <w:lsdException w:name="No Spacing" w:uiPriority="1" w:qFormat="1"/>
     <w:lsdException w:name="Light Shading" w:uiPriority="60"/>

</xml_diff>